<commit_message>
Day 3:Added tourist registration page with Digital ID
</commit_message>
<xml_diff>
--- a/Tourist_Safety_Project_Synopsis.docx
+++ b/Tourist_Safety_Project_Synopsis.docx
@@ -360,15 +360,7 @@
         <w:jc w:val="both"/>
       </w:pPr>
       <w:r>
-        <w:t xml:space="preserve">A Python-based AI module </w:t>
-      </w:r>
-      <w:proofErr w:type="spellStart"/>
-      <w:r>
-        <w:t>analyzes</w:t>
-      </w:r>
-      <w:proofErr w:type="spellEnd"/>
-      <w:r>
-        <w:t xml:space="preserve"> location data streams for anomalous patterns. The model flags situations such as: a tourist remaining stationary beyond a threshold time, excessive deviation from a registered route, or sudden loss of signal in a high-risk zone. Each tourist is assigned a live Risk Score (Low / Medium / High) visible on the dashboard.</w:t>
+        <w:t>A Python-based AI module analyzes location data streams for anomalous patterns. The model flags situations such as: a tourist remaining stationary beyond a threshold time, excessive deviation from a registered route, or sudden loss of signal in a high-risk zone. Each tourist is assigned a live Risk Score (Low / Medium / High) visible on the dashboard.</w:t>
       </w:r>
     </w:p>
     <w:p>
@@ -424,12 +416,6 @@
         <w:gridCol w:w="6360"/>
       </w:tblGrid>
       <w:tr>
-        <w:tblPrEx>
-          <w:tblCellMar>
-            <w:top w:w="0" w:type="dxa"/>
-            <w:bottom w:w="0" w:type="dxa"/>
-          </w:tblCellMar>
-        </w:tblPrEx>
         <w:tc>
           <w:tcPr>
             <w:tcW w:w="3000" w:type="dxa"/>
@@ -482,12 +468,6 @@
         </w:tc>
       </w:tr>
       <w:tr>
-        <w:tblPrEx>
-          <w:tblCellMar>
-            <w:top w:w="0" w:type="dxa"/>
-            <w:bottom w:w="0" w:type="dxa"/>
-          </w:tblCellMar>
-        </w:tblPrEx>
         <w:tc>
           <w:tcPr>
             <w:tcW w:w="3000" w:type="dxa"/>
@@ -540,12 +520,6 @@
         </w:tc>
       </w:tr>
       <w:tr>
-        <w:tblPrEx>
-          <w:tblCellMar>
-            <w:top w:w="0" w:type="dxa"/>
-            <w:bottom w:w="0" w:type="dxa"/>
-          </w:tblCellMar>
-        </w:tblPrEx>
         <w:tc>
           <w:tcPr>
             <w:tcW w:w="3000" w:type="dxa"/>
@@ -598,12 +572,6 @@
         </w:tc>
       </w:tr>
       <w:tr>
-        <w:tblPrEx>
-          <w:tblCellMar>
-            <w:top w:w="0" w:type="dxa"/>
-            <w:bottom w:w="0" w:type="dxa"/>
-          </w:tblCellMar>
-        </w:tblPrEx>
         <w:tc>
           <w:tcPr>
             <w:tcW w:w="3000" w:type="dxa"/>
@@ -656,12 +624,6 @@
         </w:tc>
       </w:tr>
       <w:tr>
-        <w:tblPrEx>
-          <w:tblCellMar>
-            <w:top w:w="0" w:type="dxa"/>
-            <w:bottom w:w="0" w:type="dxa"/>
-          </w:tblCellMar>
-        </w:tblPrEx>
         <w:tc>
           <w:tcPr>
             <w:tcW w:w="3000" w:type="dxa"/>
@@ -714,12 +676,6 @@
         </w:tc>
       </w:tr>
       <w:tr>
-        <w:tblPrEx>
-          <w:tblCellMar>
-            <w:top w:w="0" w:type="dxa"/>
-            <w:bottom w:w="0" w:type="dxa"/>
-          </w:tblCellMar>
-        </w:tblPrEx>
         <w:tc>
           <w:tcPr>
             <w:tcW w:w="3000" w:type="dxa"/>
@@ -766,26 +722,12 @@
           </w:tcPr>
           <w:p>
             <w:r>
-              <w:t xml:space="preserve">Ethereum (Hardhat + Ganache local </w:t>
-            </w:r>
-            <w:proofErr w:type="spellStart"/>
-            <w:r>
-              <w:t>testnet</w:t>
-            </w:r>
-            <w:proofErr w:type="spellEnd"/>
-            <w:r>
-              <w:t>), Solidity</w:t>
+              <w:t>Ethereum (Hardhat + Ganache local testnet), Solidity</w:t>
             </w:r>
           </w:p>
         </w:tc>
       </w:tr>
       <w:tr>
-        <w:tblPrEx>
-          <w:tblCellMar>
-            <w:top w:w="0" w:type="dxa"/>
-            <w:bottom w:w="0" w:type="dxa"/>
-          </w:tblCellMar>
-        </w:tblPrEx>
         <w:tc>
           <w:tcPr>
             <w:tcW w:w="3000" w:type="dxa"/>
@@ -832,26 +774,12 @@
           </w:tcPr>
           <w:p>
             <w:r>
-              <w:t xml:space="preserve">Leaflet.js, </w:t>
-            </w:r>
-            <w:proofErr w:type="spellStart"/>
-            <w:r>
-              <w:t>GeoJSON</w:t>
-            </w:r>
-            <w:proofErr w:type="spellEnd"/>
-            <w:r>
-              <w:t>, Turf.js</w:t>
+              <w:t>Leaflet.js, GeoJSON, Turf.js</w:t>
             </w:r>
           </w:p>
         </w:tc>
       </w:tr>
       <w:tr>
-        <w:tblPrEx>
-          <w:tblCellMar>
-            <w:top w:w="0" w:type="dxa"/>
-            <w:bottom w:w="0" w:type="dxa"/>
-          </w:tblCellMar>
-        </w:tblPrEx>
         <w:tc>
           <w:tcPr>
             <w:tcW w:w="3000" w:type="dxa"/>
@@ -904,12 +832,6 @@
         </w:tc>
       </w:tr>
       <w:tr>
-        <w:tblPrEx>
-          <w:tblCellMar>
-            <w:top w:w="0" w:type="dxa"/>
-            <w:bottom w:w="0" w:type="dxa"/>
-          </w:tblCellMar>
-        </w:tblPrEx>
         <w:tc>
           <w:tcPr>
             <w:tcW w:w="3000" w:type="dxa"/>
@@ -957,15 +879,7 @@
           </w:tcPr>
           <w:p>
             <w:r>
-              <w:t xml:space="preserve">Localhost / </w:t>
-            </w:r>
-            <w:proofErr w:type="spellStart"/>
-            <w:r>
-              <w:t>Vercel</w:t>
-            </w:r>
-            <w:proofErr w:type="spellEnd"/>
-            <w:r>
-              <w:t xml:space="preserve"> / Render</w:t>
+              <w:t>Localhost / Vercel / Render</w:t>
             </w:r>
           </w:p>
         </w:tc>
@@ -1087,446 +1001,24 @@
     </w:p>
     <w:p>
       <w:pPr>
+        <w:spacing w:before="200"/>
+      </w:pPr>
+    </w:p>
+    <w:p>
+      <w:pPr>
         <w:pStyle w:val="Heading1"/>
       </w:pPr>
       <w:r>
         <w:rPr>
           <w:color w:val="1F4E79"/>
         </w:rPr>
-        <w:t>8. Project Timeline</w:t>
-      </w:r>
-    </w:p>
-    <w:tbl>
-      <w:tblPr>
-        <w:tblW w:w="9360" w:type="dxa"/>
-        <w:tblBorders>
-          <w:top w:val="single" w:sz="4" w:space="0" w:color="auto"/>
-          <w:left w:val="single" w:sz="4" w:space="0" w:color="auto"/>
-          <w:bottom w:val="single" w:sz="4" w:space="0" w:color="auto"/>
-          <w:right w:val="single" w:sz="4" w:space="0" w:color="auto"/>
-          <w:insideH w:val="single" w:sz="4" w:space="0" w:color="auto"/>
-          <w:insideV w:val="single" w:sz="4" w:space="0" w:color="auto"/>
-        </w:tblBorders>
-        <w:tblCellMar>
-          <w:left w:w="10" w:type="dxa"/>
-          <w:right w:w="10" w:type="dxa"/>
-        </w:tblCellMar>
-        <w:tblLook w:val="0000" w:firstRow="0" w:lastRow="0" w:firstColumn="0" w:lastColumn="0" w:noHBand="0" w:noVBand="0"/>
-      </w:tblPr>
-      <w:tblGrid>
-        <w:gridCol w:w="2000"/>
-        <w:gridCol w:w="3000"/>
-        <w:gridCol w:w="4360"/>
-      </w:tblGrid>
-      <w:tr>
-        <w:tblPrEx>
-          <w:tblCellMar>
-            <w:top w:w="0" w:type="dxa"/>
-            <w:bottom w:w="0" w:type="dxa"/>
-          </w:tblCellMar>
-        </w:tblPrEx>
-        <w:tc>
-          <w:tcPr>
-            <w:tcW w:w="2000" w:type="dxa"/>
-            <w:tcBorders>
-              <w:top w:val="single" w:sz="1" w:space="0" w:color="CCCCCC"/>
-              <w:left w:val="single" w:sz="1" w:space="0" w:color="CCCCCC"/>
-              <w:bottom w:val="single" w:sz="1" w:space="0" w:color="CCCCCC"/>
-              <w:right w:val="single" w:sz="1" w:space="0" w:color="CCCCCC"/>
-            </w:tcBorders>
-            <w:shd w:val="clear" w:color="auto" w:fill="2E75B6"/>
-            <w:tcMar>
-              <w:top w:w="80" w:type="dxa"/>
-              <w:left w:w="120" w:type="dxa"/>
-              <w:bottom w:w="80" w:type="dxa"/>
-              <w:right w:w="120" w:type="dxa"/>
-            </w:tcMar>
-          </w:tcPr>
-          <w:p>
-            <w:r>
-              <w:rPr>
-                <w:b/>
-                <w:bCs/>
-                <w:color w:val="FFFFFF"/>
-              </w:rPr>
-              <w:t>Phase</w:t>
-            </w:r>
-          </w:p>
-        </w:tc>
-        <w:tc>
-          <w:tcPr>
-            <w:tcW w:w="3000" w:type="dxa"/>
-            <w:tcBorders>
-              <w:top w:val="single" w:sz="1" w:space="0" w:color="CCCCCC"/>
-              <w:left w:val="single" w:sz="1" w:space="0" w:color="CCCCCC"/>
-              <w:bottom w:val="single" w:sz="1" w:space="0" w:color="CCCCCC"/>
-              <w:right w:val="single" w:sz="1" w:space="0" w:color="CCCCCC"/>
-            </w:tcBorders>
-            <w:shd w:val="clear" w:color="auto" w:fill="2E75B6"/>
-            <w:tcMar>
-              <w:top w:w="80" w:type="dxa"/>
-              <w:left w:w="120" w:type="dxa"/>
-              <w:bottom w:w="80" w:type="dxa"/>
-              <w:right w:w="120" w:type="dxa"/>
-            </w:tcMar>
-          </w:tcPr>
-          <w:p>
-            <w:r>
-              <w:rPr>
-                <w:b/>
-                <w:bCs/>
-                <w:color w:val="FFFFFF"/>
-              </w:rPr>
-              <w:t>Activities</w:t>
-            </w:r>
-          </w:p>
-        </w:tc>
-        <w:tc>
-          <w:tcPr>
-            <w:tcW w:w="4360" w:type="dxa"/>
-            <w:tcBorders>
-              <w:top w:val="single" w:sz="1" w:space="0" w:color="CCCCCC"/>
-              <w:left w:val="single" w:sz="1" w:space="0" w:color="CCCCCC"/>
-              <w:bottom w:val="single" w:sz="1" w:space="0" w:color="CCCCCC"/>
-              <w:right w:val="single" w:sz="1" w:space="0" w:color="CCCCCC"/>
-            </w:tcBorders>
-            <w:shd w:val="clear" w:color="auto" w:fill="2E75B6"/>
-            <w:tcMar>
-              <w:top w:w="80" w:type="dxa"/>
-              <w:left w:w="120" w:type="dxa"/>
-              <w:bottom w:w="80" w:type="dxa"/>
-              <w:right w:w="120" w:type="dxa"/>
-            </w:tcMar>
-          </w:tcPr>
-          <w:p>
-            <w:r>
-              <w:rPr>
-                <w:b/>
-                <w:bCs/>
-                <w:color w:val="FFFFFF"/>
-              </w:rPr>
-              <w:t>Duration</w:t>
-            </w:r>
-          </w:p>
-        </w:tc>
-      </w:tr>
-      <w:tr>
-        <w:tblPrEx>
-          <w:tblCellMar>
-            <w:top w:w="0" w:type="dxa"/>
-            <w:bottom w:w="0" w:type="dxa"/>
-          </w:tblCellMar>
-        </w:tblPrEx>
-        <w:tc>
-          <w:tcPr>
-            <w:tcW w:w="2000" w:type="dxa"/>
-            <w:tcBorders>
-              <w:top w:val="single" w:sz="1" w:space="0" w:color="CCCCCC"/>
-              <w:left w:val="single" w:sz="1" w:space="0" w:color="CCCCCC"/>
-              <w:bottom w:val="single" w:sz="1" w:space="0" w:color="CCCCCC"/>
-              <w:right w:val="single" w:sz="1" w:space="0" w:color="CCCCCC"/>
-            </w:tcBorders>
-            <w:tcMar>
-              <w:top w:w="80" w:type="dxa"/>
-              <w:left w:w="120" w:type="dxa"/>
-              <w:bottom w:w="80" w:type="dxa"/>
-              <w:right w:w="120" w:type="dxa"/>
-            </w:tcMar>
-          </w:tcPr>
-          <w:p>
-            <w:r>
-              <w:t>Phase 1</w:t>
-            </w:r>
-          </w:p>
-        </w:tc>
-        <w:tc>
-          <w:tcPr>
-            <w:tcW w:w="3000" w:type="dxa"/>
-            <w:tcBorders>
-              <w:top w:val="single" w:sz="1" w:space="0" w:color="CCCCCC"/>
-              <w:left w:val="single" w:sz="1" w:space="0" w:color="CCCCCC"/>
-              <w:bottom w:val="single" w:sz="1" w:space="0" w:color="CCCCCC"/>
-              <w:right w:val="single" w:sz="1" w:space="0" w:color="CCCCCC"/>
-            </w:tcBorders>
-            <w:tcMar>
-              <w:top w:w="80" w:type="dxa"/>
-              <w:left w:w="120" w:type="dxa"/>
-              <w:bottom w:w="80" w:type="dxa"/>
-              <w:right w:w="120" w:type="dxa"/>
-            </w:tcMar>
-          </w:tcPr>
-          <w:p>
-            <w:r>
-              <w:t>Synopsis, Planning &amp; Architecture Design</w:t>
-            </w:r>
-          </w:p>
-        </w:tc>
-        <w:tc>
-          <w:tcPr>
-            <w:tcW w:w="4360" w:type="dxa"/>
-            <w:tcBorders>
-              <w:top w:val="single" w:sz="1" w:space="0" w:color="CCCCCC"/>
-              <w:left w:val="single" w:sz="1" w:space="0" w:color="CCCCCC"/>
-              <w:bottom w:val="single" w:sz="1" w:space="0" w:color="CCCCCC"/>
-              <w:right w:val="single" w:sz="1" w:space="0" w:color="CCCCCC"/>
-            </w:tcBorders>
-            <w:tcMar>
-              <w:top w:w="80" w:type="dxa"/>
-              <w:left w:w="120" w:type="dxa"/>
-              <w:bottom w:w="80" w:type="dxa"/>
-              <w:right w:w="120" w:type="dxa"/>
-            </w:tcMar>
-          </w:tcPr>
-          <w:p>
-            <w:r>
-              <w:t>Days 1–2</w:t>
-            </w:r>
-          </w:p>
-        </w:tc>
-      </w:tr>
-      <w:tr>
-        <w:tblPrEx>
-          <w:tblCellMar>
-            <w:top w:w="0" w:type="dxa"/>
-            <w:bottom w:w="0" w:type="dxa"/>
-          </w:tblCellMar>
-        </w:tblPrEx>
-        <w:tc>
-          <w:tcPr>
-            <w:tcW w:w="2000" w:type="dxa"/>
-            <w:tcBorders>
-              <w:top w:val="single" w:sz="1" w:space="0" w:color="CCCCCC"/>
-              <w:left w:val="single" w:sz="1" w:space="0" w:color="CCCCCC"/>
-              <w:bottom w:val="single" w:sz="1" w:space="0" w:color="CCCCCC"/>
-              <w:right w:val="single" w:sz="1" w:space="0" w:color="CCCCCC"/>
-            </w:tcBorders>
-            <w:shd w:val="clear" w:color="auto" w:fill="EBF3FB"/>
-            <w:tcMar>
-              <w:top w:w="80" w:type="dxa"/>
-              <w:left w:w="120" w:type="dxa"/>
-              <w:bottom w:w="80" w:type="dxa"/>
-              <w:right w:w="120" w:type="dxa"/>
-            </w:tcMar>
-          </w:tcPr>
-          <w:p>
-            <w:r>
-              <w:t>Phase 2</w:t>
-            </w:r>
-          </w:p>
-        </w:tc>
-        <w:tc>
-          <w:tcPr>
-            <w:tcW w:w="3000" w:type="dxa"/>
-            <w:tcBorders>
-              <w:top w:val="single" w:sz="1" w:space="0" w:color="CCCCCC"/>
-              <w:left w:val="single" w:sz="1" w:space="0" w:color="CCCCCC"/>
-              <w:bottom w:val="single" w:sz="1" w:space="0" w:color="CCCCCC"/>
-              <w:right w:val="single" w:sz="1" w:space="0" w:color="CCCCCC"/>
-            </w:tcBorders>
-            <w:shd w:val="clear" w:color="auto" w:fill="EBF3FB"/>
-            <w:tcMar>
-              <w:top w:w="80" w:type="dxa"/>
-              <w:left w:w="120" w:type="dxa"/>
-              <w:bottom w:w="80" w:type="dxa"/>
-              <w:right w:w="120" w:type="dxa"/>
-            </w:tcMar>
-          </w:tcPr>
-          <w:p>
-            <w:r>
-              <w:t>Registration, Blockchain ID, Map Setup</w:t>
-            </w:r>
-          </w:p>
-        </w:tc>
-        <w:tc>
-          <w:tcPr>
-            <w:tcW w:w="4360" w:type="dxa"/>
-            <w:tcBorders>
-              <w:top w:val="single" w:sz="1" w:space="0" w:color="CCCCCC"/>
-              <w:left w:val="single" w:sz="1" w:space="0" w:color="CCCCCC"/>
-              <w:bottom w:val="single" w:sz="1" w:space="0" w:color="CCCCCC"/>
-              <w:right w:val="single" w:sz="1" w:space="0" w:color="CCCCCC"/>
-            </w:tcBorders>
-            <w:shd w:val="clear" w:color="auto" w:fill="EBF3FB"/>
-            <w:tcMar>
-              <w:top w:w="80" w:type="dxa"/>
-              <w:left w:w="120" w:type="dxa"/>
-              <w:bottom w:w="80" w:type="dxa"/>
-              <w:right w:w="120" w:type="dxa"/>
-            </w:tcMar>
-          </w:tcPr>
-          <w:p>
-            <w:r>
-              <w:t>Days 3–7 (Week 1)</w:t>
-            </w:r>
-          </w:p>
-        </w:tc>
-      </w:tr>
-      <w:tr>
-        <w:tblPrEx>
-          <w:tblCellMar>
-            <w:top w:w="0" w:type="dxa"/>
-            <w:bottom w:w="0" w:type="dxa"/>
-          </w:tblCellMar>
-        </w:tblPrEx>
-        <w:tc>
-          <w:tcPr>
-            <w:tcW w:w="2000" w:type="dxa"/>
-            <w:tcBorders>
-              <w:top w:val="single" w:sz="1" w:space="0" w:color="CCCCCC"/>
-              <w:left w:val="single" w:sz="1" w:space="0" w:color="CCCCCC"/>
-              <w:bottom w:val="single" w:sz="1" w:space="0" w:color="CCCCCC"/>
-              <w:right w:val="single" w:sz="1" w:space="0" w:color="CCCCCC"/>
-            </w:tcBorders>
-            <w:tcMar>
-              <w:top w:w="80" w:type="dxa"/>
-              <w:left w:w="120" w:type="dxa"/>
-              <w:bottom w:w="80" w:type="dxa"/>
-              <w:right w:w="120" w:type="dxa"/>
-            </w:tcMar>
-          </w:tcPr>
-          <w:p>
-            <w:r>
-              <w:t>Phase 3</w:t>
-            </w:r>
-          </w:p>
-        </w:tc>
-        <w:tc>
-          <w:tcPr>
-            <w:tcW w:w="3000" w:type="dxa"/>
-            <w:tcBorders>
-              <w:top w:val="single" w:sz="1" w:space="0" w:color="CCCCCC"/>
-              <w:left w:val="single" w:sz="1" w:space="0" w:color="CCCCCC"/>
-              <w:bottom w:val="single" w:sz="1" w:space="0" w:color="CCCCCC"/>
-              <w:right w:val="single" w:sz="1" w:space="0" w:color="CCCCCC"/>
-            </w:tcBorders>
-            <w:tcMar>
-              <w:top w:w="80" w:type="dxa"/>
-              <w:left w:w="120" w:type="dxa"/>
-              <w:bottom w:w="80" w:type="dxa"/>
-              <w:right w:w="120" w:type="dxa"/>
-            </w:tcMar>
-          </w:tcPr>
-          <w:p>
-            <w:r>
-              <w:t>Geo-Fencing, AI Module, SOS System</w:t>
-            </w:r>
-          </w:p>
-        </w:tc>
-        <w:tc>
-          <w:tcPr>
-            <w:tcW w:w="4360" w:type="dxa"/>
-            <w:tcBorders>
-              <w:top w:val="single" w:sz="1" w:space="0" w:color="CCCCCC"/>
-              <w:left w:val="single" w:sz="1" w:space="0" w:color="CCCCCC"/>
-              <w:bottom w:val="single" w:sz="1" w:space="0" w:color="CCCCCC"/>
-              <w:right w:val="single" w:sz="1" w:space="0" w:color="CCCCCC"/>
-            </w:tcBorders>
-            <w:tcMar>
-              <w:top w:w="80" w:type="dxa"/>
-              <w:left w:w="120" w:type="dxa"/>
-              <w:bottom w:w="80" w:type="dxa"/>
-              <w:right w:w="120" w:type="dxa"/>
-            </w:tcMar>
-          </w:tcPr>
-          <w:p>
-            <w:r>
-              <w:t>Days 8–14 (Week 2)</w:t>
-            </w:r>
-          </w:p>
-        </w:tc>
-      </w:tr>
-      <w:tr>
-        <w:tblPrEx>
-          <w:tblCellMar>
-            <w:top w:w="0" w:type="dxa"/>
-            <w:bottom w:w="0" w:type="dxa"/>
-          </w:tblCellMar>
-        </w:tblPrEx>
-        <w:tc>
-          <w:tcPr>
-            <w:tcW w:w="2000" w:type="dxa"/>
-            <w:tcBorders>
-              <w:top w:val="single" w:sz="1" w:space="0" w:color="CCCCCC"/>
-              <w:left w:val="single" w:sz="1" w:space="0" w:color="CCCCCC"/>
-              <w:bottom w:val="single" w:sz="1" w:space="0" w:color="CCCCCC"/>
-              <w:right w:val="single" w:sz="1" w:space="0" w:color="CCCCCC"/>
-            </w:tcBorders>
-            <w:shd w:val="clear" w:color="auto" w:fill="EBF3FB"/>
-            <w:tcMar>
-              <w:top w:w="80" w:type="dxa"/>
-              <w:left w:w="120" w:type="dxa"/>
-              <w:bottom w:w="80" w:type="dxa"/>
-              <w:right w:w="120" w:type="dxa"/>
-            </w:tcMar>
-          </w:tcPr>
-          <w:p>
-            <w:r>
-              <w:t>Phase 4</w:t>
-            </w:r>
-          </w:p>
-        </w:tc>
-        <w:tc>
-          <w:tcPr>
-            <w:tcW w:w="3000" w:type="dxa"/>
-            <w:tcBorders>
-              <w:top w:val="single" w:sz="1" w:space="0" w:color="CCCCCC"/>
-              <w:left w:val="single" w:sz="1" w:space="0" w:color="CCCCCC"/>
-              <w:bottom w:val="single" w:sz="1" w:space="0" w:color="CCCCCC"/>
-              <w:right w:val="single" w:sz="1" w:space="0" w:color="CCCCCC"/>
-            </w:tcBorders>
-            <w:shd w:val="clear" w:color="auto" w:fill="EBF3FB"/>
-            <w:tcMar>
-              <w:top w:w="80" w:type="dxa"/>
-              <w:left w:w="120" w:type="dxa"/>
-              <w:bottom w:w="80" w:type="dxa"/>
-              <w:right w:w="120" w:type="dxa"/>
-            </w:tcMar>
-          </w:tcPr>
-          <w:p>
-            <w:r>
-              <w:t>Integration, Testing, Report &amp; Demo</w:t>
-            </w:r>
-          </w:p>
-        </w:tc>
-        <w:tc>
-          <w:tcPr>
-            <w:tcW w:w="4360" w:type="dxa"/>
-            <w:tcBorders>
-              <w:top w:val="single" w:sz="1" w:space="0" w:color="CCCCCC"/>
-              <w:left w:val="single" w:sz="1" w:space="0" w:color="CCCCCC"/>
-              <w:bottom w:val="single" w:sz="1" w:space="0" w:color="CCCCCC"/>
-              <w:right w:val="single" w:sz="1" w:space="0" w:color="CCCCCC"/>
-            </w:tcBorders>
-            <w:shd w:val="clear" w:color="auto" w:fill="EBF3FB"/>
-            <w:tcMar>
-              <w:top w:w="80" w:type="dxa"/>
-              <w:left w:w="120" w:type="dxa"/>
-              <w:bottom w:w="80" w:type="dxa"/>
-              <w:right w:w="120" w:type="dxa"/>
-            </w:tcMar>
-          </w:tcPr>
-          <w:p>
-            <w:r>
-              <w:t>Days 15–21 (Week 3)</w:t>
-            </w:r>
-          </w:p>
-        </w:tc>
-      </w:tr>
-    </w:tbl>
-    <w:p>
-      <w:pPr>
-        <w:spacing w:before="200"/>
-      </w:pPr>
-    </w:p>
-    <w:p>
-      <w:pPr>
-        <w:pStyle w:val="Heading1"/>
-      </w:pPr>
+        <w:t>8</w:t>
+      </w:r>
       <w:r>
         <w:rPr>
           <w:color w:val="1F4E79"/>
         </w:rPr>
-        <w:t>9. Conclusion</w:t>
+        <w:t>. Conclusion</w:t>
       </w:r>
     </w:p>
     <w:p>

</xml_diff>